<commit_message>
Lead the demo with the problem statement; thread it into the close
- New 'Lead with the problem' opener (10s) — direct quote Robin reads
  before clicking anything: 'Granola sits in every meeting in your org...
  Brief is what closes that loop.'
- Close callback now references 'closes the loop' for an arc that opens
  and lands on the same metaphor
- Regenerate Brief_Demo_Script.{docx,rtf,html}

Co-authored-by: Cursor <cursoragent@cursor.com>
</commit_message>
<xml_diff>
--- a/Brief_Demo_Script.docx
+++ b/Brief_Demo_Script.docx
@@ -41,7 +41,7 @@
         </w:pict>
       </w:r>
     </w:p>
-    <w:bookmarkStart w:id="10" w:name="setup"/>
+    <w:bookmarkStart w:id="10" w:name="setup-do-before-chris-joins"/>
     <w:p>
       <w:pPr>
         <w:pStyle w:val="Heading2"/>
@@ -49,6 +49,16 @@
       <w:r>
         <w:t xml:space="preserve">Setup</w:t>
       </w:r>
+      <w:r>
+        <w:t xml:space="preserve"> </w:t>
+      </w:r>
+      <w:r>
+        <w:rPr>
+          <w:i/>
+          <w:iCs/>
+        </w:rPr>
+        <w:t xml:space="preserve">(do before Chris joins)</w:t>
+      </w:r>
     </w:p>
     <w:p>
       <w:pPr>
@@ -75,13 +85,68 @@
       </w:r>
     </w:p>
     <w:bookmarkEnd w:id="10"/>
-    <w:bookmarkStart w:id="11" w:name="opening-5s"/>
+    <w:bookmarkStart w:id="11" w:name="lead-with-the-problem-10s"/>
     <w:p>
       <w:pPr>
         <w:pStyle w:val="Heading2"/>
       </w:pPr>
       <w:r>
-        <w:t xml:space="preserve">Opening — 5s</w:t>
+        <w:t xml:space="preserve">Lead with the problem — 10s</w:t>
+      </w:r>
+    </w:p>
+    <w:p>
+      <w:pPr>
+        <w:pStyle w:val="FirstParagraph"/>
+      </w:pPr>
+      <w:r>
+        <w:rPr>
+          <w:i/>
+          <w:iCs/>
+        </w:rPr>
+        <w:t xml:space="preserve">Say this before clicking anything.</w:t>
+      </w:r>
+    </w:p>
+    <w:p>
+      <w:pPr>
+        <w:pStyle w:val="BlockText"/>
+      </w:pPr>
+      <w:r>
+        <w:rPr>
+          <w:i/>
+          <w:iCs/>
+        </w:rPr>
+        <w:t xml:space="preserve">“Granola sits in every meeting in your org. That’s the most valuable knowledge graph any tool has. But the user can’t access that intel at the moment it matters most — the seconds before they walk in.</w:t>
+      </w:r>
+      <w:r>
+        <w:rPr>
+          <w:i/>
+          <w:iCs/>
+        </w:rPr>
+        <w:t xml:space="preserve"> </w:t>
+      </w:r>
+      <w:r>
+        <w:rPr>
+          <w:b/>
+          <w:bCs/>
+          <w:i/>
+          <w:iCs/>
+        </w:rPr>
+        <w:t xml:space="preserve">Brief is what closes that loop.</w:t>
+      </w:r>
+      <w:r>
+        <w:rPr>
+          <w:i/>
+          <w:iCs/>
+        </w:rPr>
+        <w:t xml:space="preserve">”</w:t>
+      </w:r>
+    </w:p>
+    <w:p>
+      <w:pPr>
+        <w:pStyle w:val="FirstParagraph"/>
+      </w:pPr>
+      <w:r>
+        <w:t xml:space="preserve">Backing it up if Chris pushes for specifics:</w:t>
       </w:r>
     </w:p>
     <w:p>
@@ -93,7 +158,7 @@
         </w:numPr>
       </w:pPr>
       <w:r>
-        <w:t xml:space="preserve">Today: click an upcoming meeting → empty</w:t>
+        <w:t xml:space="preserve">Today, those seconds = the</w:t>
       </w:r>
       <w:r>
         <w:t xml:space="preserve"> </w:t>
@@ -101,6 +166,12 @@
       <w:r>
         <w:t xml:space="preserve">“ready to record”</w:t>
       </w:r>
+      <w:r>
+        <w:t xml:space="preserve"> </w:t>
+      </w:r>
+      <w:r>
+        <w:t xml:space="preserve">empty state. Useful for recording. Useless for prep.</w:t>
+      </w:r>
     </w:p>
     <w:p>
       <w:pPr>
@@ -111,11 +182,20 @@
         </w:numPr>
       </w:pPr>
       <w:r>
-        <w:rPr>
-          <w:b/>
-          <w:bCs/>
-        </w:rPr>
-        <w:t xml:space="preserve">We replace that with one thing worth knowing</w:t>
+        <w:t xml:space="preserve">Brief replaces that empty state with</w:t>
+      </w:r>
+      <w:r>
+        <w:t xml:space="preserve"> </w:t>
+      </w:r>
+      <w:r>
+        <w:rPr>
+          <w:b/>
+          <w:bCs/>
+        </w:rPr>
+        <w:t xml:space="preserve">one thing worth knowing</w:t>
+      </w:r>
+      <w:r>
+        <w:t xml:space="preserve">, drawn from the org’s transcripts, carriable in with one click.</w:t>
       </w:r>
     </w:p>
     <w:bookmarkEnd w:id="11"/>
@@ -541,13 +621,13 @@
       </w:r>
     </w:p>
     <w:bookmarkEnd w:id="16"/>
-    <w:bookmarkStart w:id="17" w:name="close-5s"/>
+    <w:bookmarkStart w:id="17" w:name="close-10s"/>
     <w:p>
       <w:pPr>
         <w:pStyle w:val="Heading2"/>
       </w:pPr>
       <w:r>
-        <w:t xml:space="preserve">Close — 5s</w:t>
+        <w:t xml:space="preserve">Close — 10s</w:t>
       </w:r>
     </w:p>
     <w:p>
@@ -582,6 +662,35 @@
       </w:r>
       <w:r>
         <w:t xml:space="preserve">Most meetings won’t surface. When one does — it lands.</w:t>
+      </w:r>
+    </w:p>
+    <w:p>
+      <w:pPr>
+        <w:pStyle w:val="Compact"/>
+        <w:numPr>
+          <w:ilvl w:val="0"/>
+          <w:numId w:val="1008"/>
+        </w:numPr>
+      </w:pPr>
+      <w:r>
+        <w:rPr>
+          <w:b/>
+          <w:bCs/>
+        </w:rPr>
+        <w:t xml:space="preserve">Callback to the opening</w:t>
+      </w:r>
+      <w:r>
+        <w:t xml:space="preserve">:</w:t>
+      </w:r>
+      <w:r>
+        <w:t xml:space="preserve"> </w:t>
+      </w:r>
+      <w:r>
+        <w:rPr>
+          <w:i/>
+          <w:iCs/>
+        </w:rPr>
+        <w:t xml:space="preserve">“Granola was already in those rooms. Brief is what closes the loop — you walk in with what it heard.”</w:t>
       </w:r>
     </w:p>
     <w:p>
@@ -1166,7 +1275,7 @@
         <w:t xml:space="preserve"> </w:t>
       </w:r>
       <w:r>
-        <w:t xml:space="preserve">~1 min 40s walking through end-to-end · trade-offs + Qs are for when Chris drills in.</w:t>
+        <w:t xml:space="preserve">~1 min 45s end-to-end (10s problem + 90s walkthrough + 10s close). Trade-offs + Qs are for when Chris drills in.</w:t>
       </w:r>
     </w:p>
     <w:bookmarkEnd w:id="20"/>

</xml_diff>